<commit_message>
Polish thesis wording and terminology
- tighten phrasing across chapters
- normalize approximate measurements and terminology
- fix typos and improve consistency in appendices and cover text
</commit_message>
<xml_diff>
--- a/BachelorProef/thesis/cover/Kaft_bachelorproef_2025_2026_EN.docx
+++ b/BachelorProef/thesis/cover/Kaft_bachelorproef_2025_2026_EN.docx
@@ -164,6 +164,24 @@
       </w:pPr>
       <w:r>
         <w:rPr>
+          <w:rtl w:val="0"/>
+        </w:rPr>
+      </w:r>
+    </w:p>
+    <w:p>
+      <w:pPr>
+        <w:widowControl w:val="0"/>
+        <w:spacing w:line="240" w:lineRule="auto"/>
+        <w:rPr>
+          <w:b w:val="1"/>
+          <w:bCs w:val="1"/>
+          <w:smallCaps w:val="0"/>
+          <w:sz w:val="36"/>
+          <w:szCs w:val="36"/>
+        </w:rPr>
+      </w:pPr>
+      <w:r>
+        <w:rPr>
           <w:b w:val="1"/>
           <w:bCs w:val="1"/>
           <w:smallCaps w:val="0"/>
@@ -171,18 +189,10 @@
           <w:szCs w:val="36"/>
         </w:rPr>
         <w:drawing>
-          <wp:anchor allowOverlap="1" behindDoc="0" distB="114300" distT="114300" distL="114300" distR="114300" hidden="0" layoutInCell="1" locked="0" relativeHeight="0" simplePos="0">
-            <wp:simplePos x="0" y="0"/>
-            <wp:positionH relativeFrom="page">
-              <wp:posOffset>5883910</wp:posOffset>
-            </wp:positionH>
-            <wp:positionV relativeFrom="page">
-              <wp:posOffset>3312896</wp:posOffset>
-            </wp:positionV>
-            <wp:extent cx="702627" cy="702627"/>
+          <wp:inline distB="114300" distT="114300" distL="114300" distR="114300">
+            <wp:extent cx="6479230" cy="4089400"/>
             <wp:effectExtent b="0" l="0" r="0" t="0"/>
-            <wp:wrapNone/>
-            <wp:docPr id="3" name="image2.png"/>
+            <wp:docPr id="2" name="image2.png"/>
             <a:graphic>
               <a:graphicData uri="http://schemas.openxmlformats.org/drawingml/2006/picture">
                 <pic:pic>
@@ -200,7 +210,7 @@
                   <pic:spPr>
                     <a:xfrm>
                       <a:off x="0" y="0"/>
-                      <a:ext cx="702627" cy="702627"/>
+                      <a:ext cx="6479230" cy="4089400"/>
                     </a:xfrm>
                     <a:prstGeom prst="rect"/>
                     <a:ln/>
@@ -208,7 +218,7 @@
                 </pic:pic>
               </a:graphicData>
             </a:graphic>
-          </wp:anchor>
+          </wp:inline>
         </w:drawing>
       </w:r>
       <w:r>
@@ -216,47 +226,41 @@
           <w:rtl w:val="0"/>
         </w:rPr>
       </w:r>
-      <w:r>
-        <w:drawing>
-          <wp:anchor allowOverlap="1" behindDoc="0" distB="114300" distT="114300" distL="114300" distR="114300" hidden="0" layoutInCell="1" locked="0" relativeHeight="0" simplePos="0">
-            <wp:simplePos x="0" y="0"/>
-            <wp:positionH relativeFrom="column">
-              <wp:posOffset>-560859</wp:posOffset>
-            </wp:positionH>
-            <wp:positionV relativeFrom="paragraph">
-              <wp:posOffset>278520</wp:posOffset>
-            </wp:positionV>
-            <wp:extent cx="7597434" cy="4200208"/>
-            <wp:effectExtent b="0" l="0" r="0" t="0"/>
-            <wp:wrapTopAndBottom distB="114300" distT="114300"/>
-            <wp:docPr id="2" name="image3.png"/>
-            <a:graphic>
-              <a:graphicData uri="http://schemas.openxmlformats.org/drawingml/2006/picture">
-                <pic:pic>
-                  <pic:nvPicPr>
-                    <pic:cNvPr id="0" name="image3.png"/>
-                    <pic:cNvPicPr preferRelativeResize="0"/>
-                  </pic:nvPicPr>
-                  <pic:blipFill>
-                    <a:blip r:embed="rId9"/>
-                    <a:srcRect b="0" l="0" r="0" t="0"/>
-                    <a:stretch>
-                      <a:fillRect/>
-                    </a:stretch>
-                  </pic:blipFill>
-                  <pic:spPr>
-                    <a:xfrm>
-                      <a:off x="0" y="0"/>
-                      <a:ext cx="7597434" cy="4200208"/>
-                    </a:xfrm>
-                    <a:prstGeom prst="rect"/>
-                    <a:ln/>
-                  </pic:spPr>
-                </pic:pic>
-              </a:graphicData>
-            </a:graphic>
-          </wp:anchor>
-        </w:drawing>
+    </w:p>
+    <w:p>
+      <w:pPr>
+        <w:widowControl w:val="0"/>
+        <w:spacing w:line="240" w:lineRule="auto"/>
+        <w:rPr>
+          <w:b w:val="1"/>
+          <w:bCs w:val="1"/>
+          <w:smallCaps w:val="0"/>
+          <w:sz w:val="36"/>
+          <w:szCs w:val="36"/>
+        </w:rPr>
+      </w:pPr>
+      <w:r>
+        <w:rPr>
+          <w:rtl w:val="0"/>
+        </w:rPr>
+      </w:r>
+    </w:p>
+    <w:p>
+      <w:pPr>
+        <w:widowControl w:val="0"/>
+        <w:spacing w:line="240" w:lineRule="auto"/>
+        <w:rPr>
+          <w:b w:val="1"/>
+          <w:bCs w:val="1"/>
+          <w:smallCaps w:val="0"/>
+          <w:sz w:val="36"/>
+          <w:szCs w:val="36"/>
+        </w:rPr>
+      </w:pPr>
+      <w:r>
+        <w:rPr>
+          <w:rtl w:val="0"/>
+        </w:rPr>
       </w:r>
     </w:p>
     <w:p>

</xml_diff>